<commit_message>
Add test for correction of aberration planes and implement tissue generator script
</commit_message>
<xml_diff>
--- a/Diffusion optics project guidelines.docx
+++ b/Diffusion optics project guidelines.docx
@@ -1610,6 +1610,34 @@
           <w:rFonts w:eastAsiaTheme="minorEastAsia"/>
         </w:rPr>
         <w:t>field after each aberration and the field after each correction</w:t>
+      </w:r>
+    </w:p>
+    <w:p>
+      <w:pPr>
+        <w:rPr>
+          <w:rFonts w:eastAsiaTheme="minorEastAsia"/>
+          <w:u w:val="single"/>
+        </w:rPr>
+      </w:pPr>
+      <w:r>
+        <w:rPr>
+          <w:rFonts w:eastAsiaTheme="minorEastAsia"/>
+          <w:u w:val="single"/>
+        </w:rPr>
+        <w:t xml:space="preserve">Propagation kernel used in step 1</w:t>
+      </w:r>
+    </w:p>
+    <w:p>
+      <w:pPr>
+        <w:rPr>
+          <w:rFonts w:eastAsiaTheme="minorEastAsia"/>
+        </w:rPr>
+      </w:pPr>
+      <w:r>
+        <w:rPr>
+          <w:rFonts w:eastAsiaTheme="minorEastAsia"/>
+        </w:rPr>
+        <w:t xml:space="preserve">For Pε and P−ε we use the standard (exact, non-paraxial) angular spectrum kernel: H(fx,fy)=exp(i·2π·(ε/λ)·√(1−(λfx)²−(λfy)²)) for propagating components where (λfx)²+(λfy)²&lt;1, and H=0 for evanescent components where (λfx)²+(λfy)²≥1 (dropped, not propagated). λ=532nm (=0.532µm); ε and all spatial dimensions (x_max, x_stp, z_max, pixel pitch) are in µm. The alternative we are not using is the paraxial/Fresnel approximation, H(fx,fy)=exp(ikε)·exp(−iπλε(fx²+fy²)), which is cheaper but only valid for small propagation angles and does not exactly null evanescent components; at the fine sampling used here (~0.1µm pixels vs. λ=0.532µm) the exact kernel is preferred.</w:t>
       </w:r>
     </w:p>
     <w:sectPr>

</xml_diff>

<commit_message>
Started documenting phase 2 in the docx
</commit_message>
<xml_diff>
--- a/Diffusion optics project guidelines.docx
+++ b/Diffusion optics project guidelines.docx
@@ -1467,8 +1467,7 @@
     <w:p>
       <w:pPr>
         <w:rPr>
-          <w:rFonts w:hint="cs"/>
-          <w:rtl/>
+          <w:rFonts w:eastAsiaTheme="minorEastAsia"/>
         </w:rPr>
       </w:pPr>
       <w:r>
@@ -1612,6 +1611,397 @@
         <w:t>field after each aberration and the field after each correction</w:t>
       </w:r>
     </w:p>
+    <w:p>
+      <w:pPr>
+        <w:rPr>
+          <w:rFonts w:eastAsiaTheme="minorEastAsia"/>
+          <w:u w:val="single"/>
+        </w:rPr>
+      </w:pPr>
+      <w:r>
+        <w:rPr>
+          <w:rFonts w:eastAsiaTheme="minorEastAsia"/>
+          <w:u w:val="single"/>
+        </w:rPr>
+        <w:t>Sim step 2</w:t>
+      </w:r>
+    </w:p>
+    <w:p>
+      <w:pPr>
+        <w:rPr>
+          <w:rFonts w:eastAsiaTheme="minorEastAsia" w:hint="cs"/>
+          <w:rtl/>
+        </w:rPr>
+      </w:pPr>
+      <w:r>
+        <w:rPr>
+          <w:rFonts w:eastAsiaTheme="minorEastAsia"/>
+        </w:rPr>
+        <w:t xml:space="preserve">Our aim is to get </w:t>
+      </w:r>
+      <w:r>
+        <w:rPr>
+          <w:rFonts w:eastAsiaTheme="minorEastAsia"/>
+        </w:rPr>
+        <w:t xml:space="preserve">speckle statistics of the final output plane, while considering blood flow through the tissue. We will </w:t>
+      </w:r>
+      <w:r>
+        <w:rPr>
+          <w:rFonts w:eastAsiaTheme="minorEastAsia"/>
+        </w:rPr>
+        <w:t>simulate red blood cells only.</w:t>
+      </w:r>
+    </w:p>
+    <w:p>
+      <w:pPr>
+        <w:rPr>
+          <w:rFonts w:eastAsiaTheme="minorEastAsia"/>
+        </w:rPr>
+      </w:pPr>
+      <w:r>
+        <w:rPr>
+          <w:rFonts w:eastAsiaTheme="minorEastAsia"/>
+        </w:rPr>
+        <w:t xml:space="preserve">We will add </w:t>
+      </w:r>
+      <w:r>
+        <w:rPr>
+          <w:rFonts w:eastAsiaTheme="minorEastAsia"/>
+        </w:rPr>
+        <w:t xml:space="preserve">blood flow through a capillary in our tissue. </w:t>
+      </w:r>
+      <w:r>
+        <w:rPr>
+          <w:rFonts w:eastAsiaTheme="minorEastAsia"/>
+        </w:rPr>
+        <w:t xml:space="preserve">The capillary’s diameter will be uniform in space but change over time. </w:t>
+      </w:r>
+      <w:r>
+        <w:rPr>
+          <w:rFonts w:eastAsiaTheme="minorEastAsia"/>
+        </w:rPr>
+        <w:t xml:space="preserve">The capillary’s minimal diameter is </w:t>
+      </w:r>
+      <w:r>
+        <w:rPr>
+          <w:rFonts w:eastAsiaTheme="minorEastAsia"/>
+        </w:rPr>
+        <w:t>4um (most contracted) and largest is 10um.</w:t>
+      </w:r>
+      <w:r>
+        <w:rPr>
+          <w:rFonts w:eastAsiaTheme="minorEastAsia"/>
+        </w:rPr>
+        <w:t xml:space="preserve"> </w:t>
+      </w:r>
+      <w:r>
+        <w:rPr>
+          <w:rFonts w:eastAsiaTheme="minorEastAsia"/>
+        </w:rPr>
+        <w:t>Diameter will change in a sinusoidal pattern with an 8 seconds period time (freq = 1/8Hz).</w:t>
+      </w:r>
+    </w:p>
+    <w:p>
+      <w:pPr>
+        <w:rPr>
+          <w:rFonts w:eastAsiaTheme="minorEastAsia"/>
+        </w:rPr>
+      </w:pPr>
+      <w:r>
+        <w:rPr>
+          <w:rFonts w:eastAsiaTheme="minorEastAsia"/>
+        </w:rPr>
+        <w:t>Our temporal sampling interval will be 0.25 seconds (4Hz)</w:t>
+      </w:r>
+      <w:r>
+        <w:rPr>
+          <w:rFonts w:eastAsiaTheme="minorEastAsia"/>
+        </w:rPr>
+        <w:t xml:space="preserve">. The red blood vessels will travel </w:t>
+      </w:r>
+      <w:r>
+        <w:rPr>
+          <w:rFonts w:eastAsiaTheme="minorEastAsia"/>
+        </w:rPr>
+        <w:t xml:space="preserve">in a speed of </w:t>
+      </w:r>
+      <w:r>
+        <w:rPr>
+          <w:rFonts w:eastAsiaTheme="minorEastAsia"/>
+        </w:rPr>
+        <w:t xml:space="preserve">25 um/s when the capillary is dilated to </w:t>
+      </w:r>
+      <w:r>
+        <w:rPr>
+          <w:rFonts w:eastAsiaTheme="minorEastAsia"/>
+        </w:rPr>
+        <w:t xml:space="preserve">8 um/s when contracted. </w:t>
+      </w:r>
+      <w:r>
+        <w:rPr>
+          <w:rFonts w:eastAsiaTheme="minorEastAsia"/>
+        </w:rPr>
+        <w:t xml:space="preserve"> Assume a linear relation between the speed of the cells and width of the capillary.</w:t>
+      </w:r>
+    </w:p>
+    <w:p>
+      <w:pPr>
+        <w:rPr>
+          <w:rFonts w:eastAsiaTheme="minorEastAsia"/>
+        </w:rPr>
+      </w:pPr>
+      <w:r>
+        <w:rPr>
+          <w:rFonts w:eastAsiaTheme="minorEastAsia"/>
+        </w:rPr>
+        <w:t xml:space="preserve">When </w:t>
+      </w:r>
+      <w:r>
+        <w:rPr>
+          <w:rFonts w:eastAsiaTheme="minorEastAsia"/>
+        </w:rPr>
+        <w:t>the capillary is contracted the blood vessel will</w:t>
+      </w:r>
+      <w:r>
+        <w:rPr>
+          <w:rFonts w:eastAsiaTheme="minorEastAsia"/>
+        </w:rPr>
+        <w:t xml:space="preserve"> change to a bullet shape with a</w:t>
+      </w:r>
+      <w:r>
+        <w:rPr>
+          <w:rFonts w:eastAsiaTheme="minorEastAsia"/>
+        </w:rPr>
+        <w:t xml:space="preserve"> </w:t>
+      </w:r>
+      <w:r>
+        <w:rPr>
+          <w:rFonts w:eastAsiaTheme="minorEastAsia"/>
+        </w:rPr>
+        <w:t xml:space="preserve">width </w:t>
+      </w:r>
+      <w:r>
+        <w:rPr>
+          <w:rFonts w:eastAsiaTheme="minorEastAsia"/>
+        </w:rPr>
+        <w:t xml:space="preserve">of 4um and a length of </w:t>
+      </w:r>
+      <w:r>
+        <w:rPr>
+          <w:rFonts w:eastAsiaTheme="minorEastAsia"/>
+        </w:rPr>
+        <w:t>10</w:t>
+      </w:r>
+      <w:r>
+        <w:rPr>
+          <w:rFonts w:eastAsiaTheme="minorEastAsia"/>
+        </w:rPr>
+        <w:t>um</w:t>
+      </w:r>
+      <w:r>
+        <w:rPr>
+          <w:rFonts w:eastAsiaTheme="minorEastAsia"/>
+        </w:rPr>
+        <w:t>. When dilated, 8um width and 12um length.</w:t>
+      </w:r>
+      <w:r>
+        <w:rPr>
+          <w:rFonts w:eastAsiaTheme="minorEastAsia"/>
+        </w:rPr>
+        <w:t xml:space="preserve"> Assume linear relation between the dimensions and the vessel’s diameter.</w:t>
+      </w:r>
+    </w:p>
+    <w:p>
+      <w:pPr>
+        <w:rPr>
+          <w:rFonts w:eastAsiaTheme="minorEastAsia"/>
+        </w:rPr>
+      </w:pPr>
+    </w:p>
+    <w:p>
+      <w:pPr>
+        <w:pStyle w:val="ListParagraph"/>
+        <w:numPr>
+          <w:ilvl w:val="0"/>
+          <w:numId w:val="1"/>
+        </w:numPr>
+      </w:pPr>
+      <w:r>
+        <w:t>Generate a 35*35*15um tissue</w:t>
+      </w:r>
+      <w:r>
+        <w:t xml:space="preserve"> that will represent </w:t>
+      </w:r>
+      <m:oMath>
+        <m:r>
+          <w:rPr>
+            <w:rFonts w:ascii="Cambria Math" w:hAnsi="Cambria Math"/>
+          </w:rPr>
+          <m:t>t=0</m:t>
+        </m:r>
+      </m:oMath>
+      <w:r>
+        <w:t xml:space="preserve">. </w:t>
+      </w:r>
+      <w:r>
+        <w:t>After generated using the random spheres, d</w:t>
+      </w:r>
+      <w:r>
+        <w:t xml:space="preserve">esignate </w:t>
+      </w:r>
+      <w:r>
+        <w:t xml:space="preserve">a vertical tube of diameter=4um within </w:t>
+      </w:r>
+      <w:r>
+        <w:t>i</w:t>
+      </w:r>
+      <w:r>
+        <w:t>t</w:t>
+      </w:r>
+      <w:r>
+        <w:t>s center</w:t>
+      </w:r>
+      <w:r>
+        <w:t>, meaning that we start with a fully contracted blood vessel</w:t>
+      </w:r>
+      <w:r>
+        <w:t>.</w:t>
+      </w:r>
+      <w:r>
+        <w:t xml:space="preserve"> This tube will have a constant value of 1+0i unless there’s a blood cell within as stated below.</w:t>
+      </w:r>
+      <w:r>
+        <w:br/>
+      </w:r>
+    </w:p>
+    <w:p>
+      <w:pPr>
+        <w:pStyle w:val="ListParagraph"/>
+        <w:numPr>
+          <w:ilvl w:val="0"/>
+          <w:numId w:val="1"/>
+        </w:numPr>
+      </w:pPr>
+      <w:r>
+        <w:t xml:space="preserve">When the capillary contracts/dilates, the </w:t>
+      </w:r>
+      <w:r>
+        <w:t>1+0i tube will change width. Same width across the entire space.</w:t>
+      </w:r>
+      <w:r>
+        <w:br/>
+      </w:r>
+    </w:p>
+    <w:p>
+      <w:pPr>
+        <w:pStyle w:val="ListParagraph"/>
+        <w:numPr>
+          <w:ilvl w:val="0"/>
+          <w:numId w:val="1"/>
+        </w:numPr>
+      </w:pPr>
+      <w:r>
+        <w:t xml:space="preserve">At t=0 place a single red blood cell so that it’s bottom is at the bottom of the capillary, the rest </w:t>
+      </w:r>
+      <w:r>
+        <w:t xml:space="preserve">of the capillary is </w:t>
+      </w:r>
+      <w:r>
+        <w:t xml:space="preserve">“empty”. The capillary walls </w:t>
+      </w:r>
+      <w:r>
+        <w:t>have a 0 width.</w:t>
+      </w:r>
+      <w:r>
+        <w:br/>
+      </w:r>
+    </w:p>
+    <w:p>
+      <w:pPr>
+        <w:pStyle w:val="ListParagraph"/>
+        <w:numPr>
+          <w:ilvl w:val="0"/>
+          <w:numId w:val="1"/>
+        </w:numPr>
+      </w:pPr>
+      <w:r>
+        <w:t xml:space="preserve">Given that the temporal </w:t>
+      </w:r>
+      <w:r>
+        <w:rPr>
+          <w:i/>
+          <w:iCs/>
+        </w:rPr>
+        <w:t>sampling</w:t>
+      </w:r>
+      <w:r>
+        <w:t xml:space="preserve"> </w:t>
+      </w:r>
+      <w:r>
+        <w:t xml:space="preserve">interval is </w:t>
+      </w:r>
+      <w:r>
+        <w:t xml:space="preserve">4 </w:t>
+      </w:r>
+      <w:r>
+        <w:t xml:space="preserve">Hz, </w:t>
+      </w:r>
+      <w:r>
+        <w:t>and given the</w:t>
+      </w:r>
+      <w:r>
+        <w:t xml:space="preserve"> capillary contraction </w:t>
+      </w:r>
+      <w:r>
+        <w:t xml:space="preserve">rate and blood vessel, </w:t>
+      </w:r>
+      <w:r>
+        <w:t xml:space="preserve">create 3 more </w:t>
+      </w:r>
+      <w:r>
+        <w:t>tissues where the only difference is the dilation of the capillary and the speed of the cell, all other spheres are to remain the same. These 4 tissues represent a single second</w:t>
+      </w:r>
+      <w:r>
+        <w:t xml:space="preserve">, where there’s a single red blood cell in the capillary. If it finished traveling through the tissue, it should exit it and </w:t>
+      </w:r>
+      <w:r>
+        <w:lastRenderedPageBreak/>
+        <w:t>“disappear”</w:t>
+      </w:r>
+      <w:r>
+        <w:t>.</w:t>
+      </w:r>
+      <w:r>
+        <w:br/>
+      </w:r>
+    </w:p>
+    <w:p>
+      <w:pPr>
+        <w:pStyle w:val="ListParagraph"/>
+        <w:numPr>
+          <w:ilvl w:val="0"/>
+          <w:numId w:val="1"/>
+        </w:numPr>
+      </w:pPr>
+      <w:r>
+        <w:t>“Slice” each of these tissues to planes A and B as mentioned above.</w:t>
+      </w:r>
+    </w:p>
+    <w:p>
+      <w:pPr>
+        <w:pStyle w:val="ListParagraph"/>
+        <w:numPr>
+          <w:ilvl w:val="0"/>
+          <w:numId w:val="1"/>
+        </w:numPr>
+        <w:rPr>
+          <w:rtl/>
+        </w:rPr>
+      </w:pPr>
+      <w:r>
+        <w:t>Plot the phases of these planes as a function of time, a total of 2*4 subplots arranged in a (4,2) figure.</w:t>
+      </w:r>
+    </w:p>
     <w:sectPr>
       <w:pgSz w:w="12240" w:h="15840"/>
       <w:pgMar w:top="1440" w:right="1440" w:bottom="1440" w:left="1440" w:header="720" w:footer="720" w:gutter="0"/>
@@ -1620,6 +2010,103 @@
     </w:sectPr>
   </w:body>
 </w:document>
+</file>
+
+<file path=word/numbering.xml><?xml version="1.0" encoding="utf-8"?>
+<w:numbering xmlns:wpc="http://schemas.microsoft.com/office/word/2010/wordprocessingCanvas" xmlns:cx="http://schemas.microsoft.com/office/drawing/2014/chartex" xmlns:cx1="http://schemas.microsoft.com/office/drawing/2015/9/8/chartex" xmlns:cx2="http://schemas.microsoft.com/office/drawing/2015/10/21/chartex" xmlns:cx3="http://schemas.microsoft.com/office/drawing/2016/5/9/chartex" xmlns:cx4="http://schemas.microsoft.com/office/drawing/2016/5/10/chartex" xmlns:cx5="http://schemas.microsoft.com/office/drawing/2016/5/11/chartex" xmlns:cx6="http://schemas.microsoft.com/office/drawing/2016/5/12/chartex" xmlns:cx7="http://schemas.microsoft.com/office/drawing/2016/5/13/chartex" xmlns:cx8="http://schemas.microsoft.com/office/drawing/2016/5/14/chartex" xmlns:mc="http://schemas.openxmlformats.org/markup-compatibility/2006" xmlns:aink="http://schemas.microsoft.com/office/drawing/2016/ink" xmlns:am3d="http://schemas.microsoft.com/office/drawing/2017/model3d" xmlns:o="urn:schemas-microsoft-com:office:office" xmlns:oel="http://schemas.microsoft.com/office/2019/extlst" xmlns:r="http://schemas.openxmlformats.org/officeDocument/2006/relationships" xmlns:m="http://schemas.openxmlformats.org/officeDocument/2006/math" xmlns:v="urn:schemas-microsoft-com:vml" xmlns:wp14="http://schemas.microsoft.com/office/word/2010/wordprocessingDrawing" xmlns:wp="http://schemas.openxmlformats.org/drawingml/2006/wordprocessingDrawing" xmlns:w10="urn:schemas-microsoft-com:office:word" xmlns:w="http://schemas.openxmlformats.org/wordprocessingml/2006/main" xmlns:w14="http://schemas.microsoft.com/office/word/2010/wordml" xmlns:w15="http://schemas.microsoft.com/office/word/2012/wordml" xmlns:w16cei="http://schemas.microsoft.com/office/word/2026/wordml/cei" xmlns:w16cex="http://schemas.microsoft.com/office/word/2018/wordml/cex" xmlns:w16cid="http://schemas.microsoft.com/office/word/2016/wordml/cid" xmlns:w16="http://schemas.microsoft.com/office/word/2018/wordml" xmlns:w16du="http://schemas.microsoft.com/office/word/2023/wordml/word16du" xmlns:w16sdtdh="http://schemas.microsoft.com/office/word/2020/wordml/sdtdatahash" xmlns:w16sdtfl="http://schemas.microsoft.com/office/word/2024/wordml/sdtformatlock" xmlns:w16se="http://schemas.microsoft.com/office/word/2015/wordml/symex" xmlns:wpg="http://schemas.microsoft.com/office/word/2010/wordprocessingGroup" xmlns:wpi="http://schemas.microsoft.com/office/word/2010/wordprocessingInk" xmlns:wne="http://schemas.microsoft.com/office/word/2006/wordml" xmlns:wps="http://schemas.microsoft.com/office/word/2010/wordprocessingShape" mc:Ignorable="w14 w15 w16se w16cid w16 w16cex w16sdtdh w16sdtfl w16du wp14">
+  <w:abstractNum w:abstractNumId="0" w15:restartNumberingAfterBreak="0">
+    <w:nsid w:val="295F5637"/>
+    <w:multiLevelType w:val="hybridMultilevel"/>
+    <w:tmpl w:val="CD2223C4"/>
+    <w:lvl w:ilvl="0" w:tplc="CC961D70">
+      <w:start w:val="1"/>
+      <w:numFmt w:val="decimal"/>
+      <w:lvlText w:val="%1."/>
+      <w:lvlJc w:val="left"/>
+      <w:pPr>
+        <w:ind w:left="720" w:hanging="360"/>
+      </w:pPr>
+      <w:rPr>
+        <w:rFonts w:eastAsiaTheme="minorEastAsia" w:hint="default"/>
+      </w:rPr>
+    </w:lvl>
+    <w:lvl w:ilvl="1" w:tplc="04090019" w:tentative="1">
+      <w:start w:val="1"/>
+      <w:numFmt w:val="lowerLetter"/>
+      <w:lvlText w:val="%2."/>
+      <w:lvlJc w:val="left"/>
+      <w:pPr>
+        <w:ind w:left="1440" w:hanging="360"/>
+      </w:pPr>
+    </w:lvl>
+    <w:lvl w:ilvl="2" w:tplc="0409001B" w:tentative="1">
+      <w:start w:val="1"/>
+      <w:numFmt w:val="lowerRoman"/>
+      <w:lvlText w:val="%3."/>
+      <w:lvlJc w:val="right"/>
+      <w:pPr>
+        <w:ind w:left="2160" w:hanging="180"/>
+      </w:pPr>
+    </w:lvl>
+    <w:lvl w:ilvl="3" w:tplc="0409000F" w:tentative="1">
+      <w:start w:val="1"/>
+      <w:numFmt w:val="decimal"/>
+      <w:lvlText w:val="%4."/>
+      <w:lvlJc w:val="left"/>
+      <w:pPr>
+        <w:ind w:left="2880" w:hanging="360"/>
+      </w:pPr>
+    </w:lvl>
+    <w:lvl w:ilvl="4" w:tplc="04090019" w:tentative="1">
+      <w:start w:val="1"/>
+      <w:numFmt w:val="lowerLetter"/>
+      <w:lvlText w:val="%5."/>
+      <w:lvlJc w:val="left"/>
+      <w:pPr>
+        <w:ind w:left="3600" w:hanging="360"/>
+      </w:pPr>
+    </w:lvl>
+    <w:lvl w:ilvl="5" w:tplc="0409001B" w:tentative="1">
+      <w:start w:val="1"/>
+      <w:numFmt w:val="lowerRoman"/>
+      <w:lvlText w:val="%6."/>
+      <w:lvlJc w:val="right"/>
+      <w:pPr>
+        <w:ind w:left="4320" w:hanging="180"/>
+      </w:pPr>
+    </w:lvl>
+    <w:lvl w:ilvl="6" w:tplc="0409000F" w:tentative="1">
+      <w:start w:val="1"/>
+      <w:numFmt w:val="decimal"/>
+      <w:lvlText w:val="%7."/>
+      <w:lvlJc w:val="left"/>
+      <w:pPr>
+        <w:ind w:left="5040" w:hanging="360"/>
+      </w:pPr>
+    </w:lvl>
+    <w:lvl w:ilvl="7" w:tplc="04090019" w:tentative="1">
+      <w:start w:val="1"/>
+      <w:numFmt w:val="lowerLetter"/>
+      <w:lvlText w:val="%8."/>
+      <w:lvlJc w:val="left"/>
+      <w:pPr>
+        <w:ind w:left="5760" w:hanging="360"/>
+      </w:pPr>
+    </w:lvl>
+    <w:lvl w:ilvl="8" w:tplc="0409001B" w:tentative="1">
+      <w:start w:val="1"/>
+      <w:numFmt w:val="lowerRoman"/>
+      <w:lvlText w:val="%9."/>
+      <w:lvlJc w:val="right"/>
+      <w:pPr>
+        <w:ind w:left="6480" w:hanging="180"/>
+      </w:pPr>
+    </w:lvl>
+  </w:abstractNum>
+  <w:num w:numId="1" w16cid:durableId="58983733">
+    <w:abstractNumId w:val="0"/>
+  </w:num>
+</w:numbering>
 </file>
 
 <file path=word/styles.xml><?xml version="1.0" encoding="utf-8"?>
@@ -2225,6 +2712,7 @@
   <w:style w:type="character" w:default="1" w:styleId="DefaultParagraphFont">
     <w:name w:val="Default Paragraph Font"/>
     <w:uiPriority w:val="1"/>
+    <w:semiHidden/>
     <w:unhideWhenUsed/>
   </w:style>
   <w:style w:type="table" w:default="1" w:styleId="TableNormal">

</xml_diff>

<commit_message>
More phase 2 instructions
</commit_message>
<xml_diff>
--- a/Diffusion optics project guidelines.docx
+++ b/Diffusion optics project guidelines.docx
@@ -1629,7 +1629,7 @@
     <w:p>
       <w:pPr>
         <w:rPr>
-          <w:rFonts w:eastAsiaTheme="minorEastAsia" w:hint="cs"/>
+          <w:rFonts w:eastAsiaTheme="minorEastAsia"/>
           <w:rtl/>
         </w:rPr>
       </w:pPr>
@@ -1741,7 +1741,19 @@
         <w:rPr>
           <w:rFonts w:eastAsiaTheme="minorEastAsia"/>
         </w:rPr>
-        <w:t xml:space="preserve"> Assume a linear relation between the speed of the cells and width of the capillary.</w:t>
+        <w:t xml:space="preserve"> Assume a linear relation between the speed of the cells and width of the capillary</w:t>
+      </w:r>
+      <w:r>
+        <w:rPr>
+          <w:rFonts w:eastAsiaTheme="minorEastAsia"/>
+        </w:rPr>
+        <w:t>, meaning the speed at a time t depends on the width at the same time t</w:t>
+      </w:r>
+      <w:r>
+        <w:rPr>
+          <w:rFonts w:eastAsiaTheme="minorEastAsia"/>
+        </w:rPr>
+        <w:t>.</w:t>
       </w:r>
     </w:p>
     <w:p>
@@ -1809,6 +1821,39 @@
           <w:rFonts w:eastAsiaTheme="minorEastAsia"/>
         </w:rPr>
         <w:t xml:space="preserve"> Assume linear relation between the dimensions and the vessel’s diameter.</w:t>
+      </w:r>
+      <w:r>
+        <w:rPr>
+          <w:rFonts w:eastAsiaTheme="minorEastAsia"/>
+        </w:rPr>
+        <w:t xml:space="preserve"> We will model the cell as a rectangular box.</w:t>
+      </w:r>
+    </w:p>
+    <w:p>
+      <w:pPr>
+        <w:rPr>
+          <w:rFonts w:eastAsiaTheme="minorEastAsia"/>
+        </w:rPr>
+      </w:pPr>
+    </w:p>
+    <w:p>
+      <w:pPr>
+        <w:rPr>
+          <w:rFonts w:eastAsiaTheme="minorEastAsia" w:hint="cs"/>
+          <w:rtl/>
+        </w:rPr>
+      </w:pPr>
+      <w:r>
+        <w:rPr>
+          <w:rFonts w:eastAsiaTheme="minorEastAsia"/>
+        </w:rPr>
+        <w:t>Red blood cell has an refractive index of 1.38</w:t>
+      </w:r>
+      <w:r>
+        <w:rPr>
+          <w:rFonts w:eastAsiaTheme="minorEastAsia"/>
+        </w:rPr>
+        <w:t xml:space="preserve"> for a 532nm wavelength.</w:t>
       </w:r>
     </w:p>
     <w:p>
@@ -1850,7 +1895,13 @@
         <w:t xml:space="preserve">esignate </w:t>
       </w:r>
       <w:r>
-        <w:t xml:space="preserve">a vertical tube of diameter=4um within </w:t>
+        <w:t>a vertical</w:t>
+      </w:r>
+      <w:r>
+        <w:t xml:space="preserve"> (in the XY plane, parallel to Y)</w:t>
+      </w:r>
+      <w:r>
+        <w:t xml:space="preserve"> tube of diameter=4um within </w:t>
       </w:r>
       <w:r>
         <w:t>i</w:t>
@@ -1901,10 +1952,23 @@
         </w:numPr>
       </w:pPr>
       <w:r>
-        <w:t xml:space="preserve">At t=0 place a single red blood cell so that it’s bottom is at the bottom of the capillary, the rest </w:t>
-      </w:r>
-      <w:r>
-        <w:t xml:space="preserve">of the capillary is </w:t>
+        <w:t>At t=0 place a single red blood cell so that its bottom is at the bottom of the capillary</w:t>
+      </w:r>
+      <w:r>
+        <w:t xml:space="preserve"> (edge of the tissue)</w:t>
+      </w:r>
+      <w:r>
+        <w:t xml:space="preserve"> and it will propagate further into the tissue.</w:t>
+      </w:r>
+      <w:r>
+        <w:t xml:space="preserve"> the rest </w:t>
+      </w:r>
+      <w:r>
+        <w:t xml:space="preserve">of the </w:t>
+      </w:r>
+      <w:r>
+        <w:lastRenderedPageBreak/>
+        <w:t xml:space="preserve">capillary is </w:t>
       </w:r>
       <w:r>
         <w:t xml:space="preserve">“empty”. The capillary walls </w:t>
@@ -1962,11 +2026,7 @@
         <w:t>tissues where the only difference is the dilation of the capillary and the speed of the cell, all other spheres are to remain the same. These 4 tissues represent a single second</w:t>
       </w:r>
       <w:r>
-        <w:t xml:space="preserve">, where there’s a single red blood cell in the capillary. If it finished traveling through the tissue, it should exit it and </w:t>
-      </w:r>
-      <w:r>
-        <w:lastRenderedPageBreak/>
-        <w:t>“disappear”</w:t>
+        <w:t>, where there’s a single red blood cell in the capillary. If it finished traveling through the tissue, it should exit it and “disappear”</w:t>
       </w:r>
       <w:r>
         <w:t>.</w:t>

</xml_diff>